<commit_message>
Tiền lương: tác phong tự tính, kỳ việc N / nợ N−1, phụ cấp trên app, phiếu lương nhân viên xác nhận
- Nhân viên tự khai số lần vi phạm tác phong cùng ngày công (sql/34); tác phong người = 100 − 20 × số lần,
  phòng = trung bình; điểm KPI phòng = TB(việc, nợ, tác phong) → app tự tính thưởng phòng, Excel tự tính lại.
- Kỳ số liệu anh chốt lại 19/10/2026: lương tháng N lấy %-công việc N, %-công nợ N−1, doanh thu N.
- Phụ cấp / điều chỉnh ngoại lệ nhập ngay trên tab Bảng lương (trước khi chốt).
- Chốt xong 'Gửi nhân viên xác nhận'; tab 'Phiếu lương của tôi' — mỗi người chỉ thấy phiếu mình,
  Xác nhận / Báo sai kèm ghi chú; mở chốt là thu hồi phiếu.
- Cập nhật hướng dẫn nhân viên (markdown + Word).

Co-Authored-By: Claude Opus 5.5 <noreply@anthropic.com>
</commit_message>
<xml_diff>
--- a/docs/huong-dan-cham-cong-luong.docx
+++ b/docs/huong-dan-cham-cong-luong.docx
@@ -53,7 +53,7 @@
         <w:spacing w:after="120"/>
       </w:pPr>
       <w:r>
-        <w:t xml:space="preserve">Ba phần: chấm công · thưởng dịch vụ khác · dành cho trưởng phòng · hỏi đáp.</w:t>
+        <w:t xml:space="preserve">Các phần: chấm công · thưởng dịch vụ khác · phiếu lương · dành cho trưởng phòng · hỏi đáp.</w:t>
       </w:r>
     </w:p>
     <w:p>
@@ -85,9 +85,9 @@
         </w:tblBorders>
       </w:tblPr>
       <w:tblGrid>
-        <w:gridCol w:w="2952"/>
-        <w:gridCol w:w="5210"/>
-        <w:gridCol w:w="1476"/>
+        <w:gridCol w:w="2825"/>
+        <w:gridCol w:w="5401"/>
+        <w:gridCol w:w="1412"/>
       </w:tblGrid>
       <w:tr>
         <w:trPr>
@@ -95,7 +95,7 @@
         </w:trPr>
         <w:tc>
           <w:tcPr>
-            <w:tcW w:type="dxa" w:w="2952"/>
+            <w:tcW w:type="dxa" w:w="2825"/>
             <w:tcBorders>
               <w:top w:val="single" w:color="D6D3D1" w:sz="4"/>
               <w:left w:val="single" w:color="D6D3D1" w:sz="4"/>
@@ -123,7 +123,7 @@
         </w:tc>
         <w:tc>
           <w:tcPr>
-            <w:tcW w:type="dxa" w:w="5210"/>
+            <w:tcW w:type="dxa" w:w="5401"/>
             <w:tcBorders>
               <w:top w:val="single" w:color="D6D3D1" w:sz="4"/>
               <w:left w:val="single" w:color="D6D3D1" w:sz="4"/>
@@ -151,7 +151,7 @@
         </w:tc>
         <w:tc>
           <w:tcPr>
-            <w:tcW w:type="dxa" w:w="1476"/>
+            <w:tcW w:type="dxa" w:w="1412"/>
             <w:tcBorders>
               <w:top w:val="single" w:color="D6D3D1" w:sz="4"/>
               <w:left w:val="single" w:color="D6D3D1" w:sz="4"/>
@@ -184,7 +184,7 @@
         </w:trPr>
         <w:tc>
           <w:tcPr>
-            <w:tcW w:type="dxa" w:w="2952"/>
+            <w:tcW w:type="dxa" w:w="2825"/>
             <w:tcBorders>
               <w:top w:val="single" w:color="D6D3D1" w:sz="4"/>
               <w:left w:val="single" w:color="D6D3D1" w:sz="4"/>
@@ -206,7 +206,7 @@
         </w:tc>
         <w:tc>
           <w:tcPr>
-            <w:tcW w:type="dxa" w:w="5210"/>
+            <w:tcW w:type="dxa" w:w="5401"/>
             <w:tcBorders>
               <w:top w:val="single" w:color="D6D3D1" w:sz="4"/>
               <w:left w:val="single" w:color="D6D3D1" w:sz="4"/>
@@ -235,7 +235,7 @@
         </w:tc>
         <w:tc>
           <w:tcPr>
-            <w:tcW w:type="dxa" w:w="1476"/>
+            <w:tcW w:type="dxa" w:w="1412"/>
             <w:tcBorders>
               <w:top w:val="single" w:color="D6D3D1" w:sz="4"/>
               <w:left w:val="single" w:color="D6D3D1" w:sz="4"/>
@@ -262,7 +262,7 @@
         </w:trPr>
         <w:tc>
           <w:tcPr>
-            <w:tcW w:type="dxa" w:w="2952"/>
+            <w:tcW w:type="dxa" w:w="2825"/>
             <w:tcBorders>
               <w:top w:val="single" w:color="D6D3D1" w:sz="4"/>
               <w:left w:val="single" w:color="D6D3D1" w:sz="4"/>
@@ -285,7 +285,7 @@
         </w:tc>
         <w:tc>
           <w:tcPr>
-            <w:tcW w:type="dxa" w:w="5210"/>
+            <w:tcW w:type="dxa" w:w="5401"/>
             <w:tcBorders>
               <w:top w:val="single" w:color="D6D3D1" w:sz="4"/>
               <w:left w:val="single" w:color="D6D3D1" w:sz="4"/>
@@ -318,7 +318,7 @@
         </w:tc>
         <w:tc>
           <w:tcPr>
-            <w:tcW w:type="dxa" w:w="1476"/>
+            <w:tcW w:type="dxa" w:w="1412"/>
             <w:tcBorders>
               <w:top w:val="single" w:color="D6D3D1" w:sz="4"/>
               <w:left w:val="single" w:color="D6D3D1" w:sz="4"/>
@@ -346,7 +346,7 @@
         </w:trPr>
         <w:tc>
           <w:tcPr>
-            <w:tcW w:type="dxa" w:w="2952"/>
+            <w:tcW w:type="dxa" w:w="2825"/>
             <w:tcBorders>
               <w:top w:val="single" w:color="D6D3D1" w:sz="4"/>
               <w:left w:val="single" w:color="D6D3D1" w:sz="4"/>
@@ -368,7 +368,7 @@
         </w:tc>
         <w:tc>
           <w:tcPr>
-            <w:tcW w:type="dxa" w:w="5210"/>
+            <w:tcW w:type="dxa" w:w="5401"/>
             <w:tcBorders>
               <w:top w:val="single" w:color="D6D3D1" w:sz="4"/>
               <w:left w:val="single" w:color="D6D3D1" w:sz="4"/>
@@ -390,7 +390,7 @@
         </w:tc>
         <w:tc>
           <w:tcPr>
-            <w:tcW w:type="dxa" w:w="1476"/>
+            <w:tcW w:type="dxa" w:w="1412"/>
             <w:tcBorders>
               <w:top w:val="single" w:color="D6D3D1" w:sz="4"/>
               <w:left w:val="single" w:color="D6D3D1" w:sz="4"/>
@@ -407,6 +407,107 @@
           <w:p>
             <w:r>
               <w:t xml:space="preserve">Trưởng phòng</w:t>
+            </w:r>
+          </w:p>
+        </w:tc>
+      </w:tr>
+      <w:tr>
+        <w:trPr>
+          <w:tblHeader w:val="false"/>
+        </w:trPr>
+        <w:tc>
+          <w:tcPr>
+            <w:tcW w:type="dxa" w:w="2825"/>
+            <w:tcBorders>
+              <w:top w:val="single" w:color="D6D3D1" w:sz="4"/>
+              <w:left w:val="single" w:color="D6D3D1" w:sz="4"/>
+              <w:bottom w:val="single" w:color="D6D3D1" w:sz="4"/>
+              <w:right w:val="single" w:color="D6D3D1" w:sz="4"/>
+            </w:tcBorders>
+            <w:shd w:fill="FAFAF9" w:color="auto" w:val="clear"/>
+            <w:tcMar>
+              <w:top w:type="dxa" w:w="60"/>
+              <w:left w:type="dxa" w:w="100"/>
+              <w:bottom w:type="dxa" w:w="60"/>
+              <w:right w:type="dxa" w:w="100"/>
+            </w:tcMar>
+          </w:tcPr>
+          <w:p>
+            <w:r>
+              <w:t xml:space="preserve">Khi kế toán gửi phiếu lương</w:t>
+            </w:r>
+          </w:p>
+        </w:tc>
+        <w:tc>
+          <w:tcPr>
+            <w:tcW w:type="dxa" w:w="5401"/>
+            <w:tcBorders>
+              <w:top w:val="single" w:color="D6D3D1" w:sz="4"/>
+              <w:left w:val="single" w:color="D6D3D1" w:sz="4"/>
+              <w:bottom w:val="single" w:color="D6D3D1" w:sz="4"/>
+              <w:right w:val="single" w:color="D6D3D1" w:sz="4"/>
+            </w:tcBorders>
+            <w:shd w:fill="FAFAF9" w:color="auto" w:val="clear"/>
+            <w:tcMar>
+              <w:top w:type="dxa" w:w="60"/>
+              <w:left w:type="dxa" w:w="100"/>
+              <w:bottom w:type="dxa" w:w="60"/>
+              <w:right w:type="dxa" w:w="100"/>
+            </w:tcMar>
+          </w:tcPr>
+          <w:p>
+            <w:r>
+              <w:t xml:space="preserve">Mở tab </w:t>
+            </w:r>
+            <w:r>
+              <w:rPr>
+                <w:b/>
+                <w:bCs/>
+              </w:rPr>
+              <w:t xml:space="preserve">Phiếu lương của tôi</w:t>
+            </w:r>
+            <w:r>
+              <w:t xml:space="preserve">, bấm </w:t>
+            </w:r>
+            <w:r>
+              <w:rPr>
+                <w:b/>
+                <w:bCs/>
+              </w:rPr>
+              <w:t xml:space="preserve">Xác nhận</w:t>
+            </w:r>
+            <w:r>
+              <w:t xml:space="preserve"> hoặc </w:t>
+            </w:r>
+            <w:r>
+              <w:rPr>
+                <w:b/>
+                <w:bCs/>
+              </w:rPr>
+              <w:t xml:space="preserve">Báo sai</w:t>
+            </w:r>
+          </w:p>
+        </w:tc>
+        <w:tc>
+          <w:tcPr>
+            <w:tcW w:type="dxa" w:w="1412"/>
+            <w:tcBorders>
+              <w:top w:val="single" w:color="D6D3D1" w:sz="4"/>
+              <w:left w:val="single" w:color="D6D3D1" w:sz="4"/>
+              <w:bottom w:val="single" w:color="D6D3D1" w:sz="4"/>
+              <w:right w:val="single" w:color="D6D3D1" w:sz="4"/>
+            </w:tcBorders>
+            <w:shd w:fill="FAFAF9" w:color="auto" w:val="clear"/>
+            <w:tcMar>
+              <w:top w:type="dxa" w:w="60"/>
+              <w:left w:type="dxa" w:w="100"/>
+              <w:bottom w:type="dxa" w:w="60"/>
+              <w:right w:type="dxa" w:w="100"/>
+            </w:tcMar>
+          </w:tcPr>
+          <w:p>
+            <w:r>
+              <w:t xml:space="preserve">Mọi nhân viên</w:t>
             </w:r>
           </w:p>
         </w:tc>
@@ -578,8 +679,8 @@
         </w:tblBorders>
       </w:tblPr>
       <w:tblGrid>
-        <w:gridCol w:w="1667"/>
-        <w:gridCol w:w="7971"/>
+        <w:gridCol w:w="1412"/>
+        <w:gridCol w:w="8226"/>
       </w:tblGrid>
       <w:tr>
         <w:trPr>
@@ -587,7 +688,7 @@
         </w:trPr>
         <w:tc>
           <w:tcPr>
-            <w:tcW w:type="dxa" w:w="1667"/>
+            <w:tcW w:type="dxa" w:w="1412"/>
             <w:tcBorders>
               <w:top w:val="single" w:color="D6D3D1" w:sz="4"/>
               <w:left w:val="single" w:color="D6D3D1" w:sz="4"/>
@@ -615,7 +716,7 @@
         </w:tc>
         <w:tc>
           <w:tcPr>
-            <w:tcW w:type="dxa" w:w="7971"/>
+            <w:tcW w:type="dxa" w:w="8226"/>
             <w:tcBorders>
               <w:top w:val="single" w:color="D6D3D1" w:sz="4"/>
               <w:left w:val="single" w:color="D6D3D1" w:sz="4"/>
@@ -648,7 +749,7 @@
         </w:trPr>
         <w:tc>
           <w:tcPr>
-            <w:tcW w:type="dxa" w:w="1667"/>
+            <w:tcW w:type="dxa" w:w="1412"/>
             <w:tcBorders>
               <w:top w:val="single" w:color="D6D3D1" w:sz="4"/>
               <w:left w:val="single" w:color="D6D3D1" w:sz="4"/>
@@ -677,7 +778,7 @@
         </w:tc>
         <w:tc>
           <w:tcPr>
-            <w:tcW w:type="dxa" w:w="7971"/>
+            <w:tcW w:type="dxa" w:w="8226"/>
             <w:tcBorders>
               <w:top w:val="single" w:color="D6D3D1" w:sz="4"/>
               <w:left w:val="single" w:color="D6D3D1" w:sz="4"/>
@@ -724,7 +825,7 @@
         </w:trPr>
         <w:tc>
           <w:tcPr>
-            <w:tcW w:type="dxa" w:w="1667"/>
+            <w:tcW w:type="dxa" w:w="1412"/>
             <w:tcBorders>
               <w:top w:val="single" w:color="D6D3D1" w:sz="4"/>
               <w:left w:val="single" w:color="D6D3D1" w:sz="4"/>
@@ -754,7 +855,7 @@
         </w:tc>
         <w:tc>
           <w:tcPr>
-            <w:tcW w:type="dxa" w:w="7971"/>
+            <w:tcW w:type="dxa" w:w="8226"/>
             <w:tcBorders>
               <w:top w:val="single" w:color="D6D3D1" w:sz="4"/>
               <w:left w:val="single" w:color="D6D3D1" w:sz="4"/>
@@ -792,7 +893,7 @@
         </w:trPr>
         <w:tc>
           <w:tcPr>
-            <w:tcW w:type="dxa" w:w="1667"/>
+            <w:tcW w:type="dxa" w:w="1412"/>
             <w:tcBorders>
               <w:top w:val="single" w:color="D6D3D1" w:sz="4"/>
               <w:left w:val="single" w:color="D6D3D1" w:sz="4"/>
@@ -821,7 +922,7 @@
         </w:tc>
         <w:tc>
           <w:tcPr>
-            <w:tcW w:type="dxa" w:w="7971"/>
+            <w:tcW w:type="dxa" w:w="8226"/>
             <w:tcBorders>
               <w:top w:val="single" w:color="D6D3D1" w:sz="4"/>
               <w:left w:val="single" w:color="D6D3D1" w:sz="4"/>
@@ -848,7 +949,7 @@
         </w:trPr>
         <w:tc>
           <w:tcPr>
-            <w:tcW w:type="dxa" w:w="1667"/>
+            <w:tcW w:type="dxa" w:w="1412"/>
             <w:tcBorders>
               <w:top w:val="single" w:color="D6D3D1" w:sz="4"/>
               <w:left w:val="single" w:color="D6D3D1" w:sz="4"/>
@@ -878,7 +979,7 @@
         </w:tc>
         <w:tc>
           <w:tcPr>
-            <w:tcW w:type="dxa" w:w="7971"/>
+            <w:tcW w:type="dxa" w:w="8226"/>
             <w:tcBorders>
               <w:top w:val="single" w:color="D6D3D1" w:sz="4"/>
               <w:left w:val="single" w:color="D6D3D1" w:sz="4"/>
@@ -900,6 +1001,62 @@
           </w:p>
         </w:tc>
       </w:tr>
+      <w:tr>
+        <w:trPr>
+          <w:tblHeader w:val="false"/>
+        </w:trPr>
+        <w:tc>
+          <w:tcPr>
+            <w:tcW w:type="dxa" w:w="1412"/>
+            <w:tcBorders>
+              <w:top w:val="single" w:color="D6D3D1" w:sz="4"/>
+              <w:left w:val="single" w:color="D6D3D1" w:sz="4"/>
+              <w:bottom w:val="single" w:color="D6D3D1" w:sz="4"/>
+              <w:right w:val="single" w:color="D6D3D1" w:sz="4"/>
+            </w:tcBorders>
+            <w:tcMar>
+              <w:top w:type="dxa" w:w="60"/>
+              <w:left w:type="dxa" w:w="100"/>
+              <w:bottom w:type="dxa" w:w="60"/>
+              <w:right w:type="dxa" w:w="100"/>
+            </w:tcMar>
+          </w:tcPr>
+          <w:p>
+            <w:r>
+              <w:rPr>
+                <w:b/>
+                <w:bCs/>
+              </w:rPr>
+              <w:t xml:space="preserve">Số lần vi phạm tác phong</w:t>
+            </w:r>
+            <w:r>
+              <w:t xml:space="preserve"> (tím)</w:t>
+            </w:r>
+          </w:p>
+        </w:tc>
+        <w:tc>
+          <w:tcPr>
+            <w:tcW w:type="dxa" w:w="8226"/>
+            <w:tcBorders>
+              <w:top w:val="single" w:color="D6D3D1" w:sz="4"/>
+              <w:left w:val="single" w:color="D6D3D1" w:sz="4"/>
+              <w:bottom w:val="single" w:color="D6D3D1" w:sz="4"/>
+              <w:right w:val="single" w:color="D6D3D1" w:sz="4"/>
+            </w:tcBorders>
+            <w:tcMar>
+              <w:top w:type="dxa" w:w="60"/>
+              <w:left w:type="dxa" w:w="100"/>
+              <w:bottom w:type="dxa" w:w="60"/>
+              <w:right w:type="dxa" w:w="100"/>
+            </w:tcMar>
+          </w:tcPr>
+          <w:p>
+            <w:r>
+              <w:t xml:space="preserve">Tự khai số lần vi phạm tác phong trong tháng. Mỗi lần trừ 20% tác phong của bạn (0 lần = 100%, 2 lần = 60%). Tác phong của cả phòng là trung bình mọi người — ảnh hưởng thưởng KPI phòng của cả phòng.</w:t>
+            </w:r>
+          </w:p>
+        </w:tc>
+      </w:tr>
     </w:tbl>
     <w:p/>
     <w:p>
@@ -1012,6 +1169,29 @@
       </w:r>
       <w:r>
         <w:t xml:space="preserve">.</w:t>
+      </w:r>
+    </w:p>
+    <w:p>
+      <w:pPr>
+        <w:pStyle w:val="ListParagraph"/>
+        <w:numPr>
+          <w:ilvl w:val="0"/>
+          <w:numId w:val="2"/>
+        </w:numPr>
+        <w:spacing w:after="60"/>
+      </w:pPr>
+      <w:r>
+        <w:t xml:space="preserve">Gõ </w:t>
+      </w:r>
+      <w:r>
+        <w:rPr>
+          <w:b/>
+          <w:bCs/>
+        </w:rPr>
+        <w:t xml:space="preserve">số lần vi phạm tác phong</w:t>
+      </w:r>
+      <w:r>
+        <w:t xml:space="preserve"> trong tháng (không có thì để 0).</w:t>
       </w:r>
     </w:p>
     <w:p>
@@ -1719,7 +1899,178 @@
         <w:pStyle w:val="Heading1"/>
       </w:pPr>
       <w:r>
-        <w:t xml:space="preserve">Phần 3 — Dành cho trưởng phòng</w:t>
+        <w:t xml:space="preserve">Phần 3 — Phiếu lương của tôi</w:t>
+      </w:r>
+    </w:p>
+    <w:p>
+      <w:pPr>
+        <w:spacing w:after="120"/>
+      </w:pPr>
+      <w:r>
+        <w:t xml:space="preserve">Kế toán nội bộ chốt bảng lương xong sẽ </w:t>
+      </w:r>
+      <w:r>
+        <w:rPr>
+          <w:b/>
+          <w:bCs/>
+        </w:rPr>
+        <w:t xml:space="preserve">gửi phiếu lương</w:t>
+      </w:r>
+      <w:r>
+        <w:t xml:space="preserve"> cho từng người. Vào tab </w:t>
+      </w:r>
+      <w:r>
+        <w:rPr>
+          <w:b/>
+          <w:bCs/>
+        </w:rPr>
+        <w:t xml:space="preserve">Phiếu lương của tôi</w:t>
+      </w:r>
+      <w:r>
+        <w:t xml:space="preserve"> — bạn </w:t>
+      </w:r>
+      <w:r>
+        <w:rPr>
+          <w:b/>
+          <w:bCs/>
+        </w:rPr>
+        <w:t xml:space="preserve">chỉ thấy phiếu của chính mình</w:t>
+      </w:r>
+      <w:r>
+        <w:t xml:space="preserve">.</w:t>
+      </w:r>
+    </w:p>
+    <w:p>
+      <w:pPr>
+        <w:spacing w:after="120"/>
+      </w:pPr>
+      <w:r>
+        <w:t xml:space="preserve">Phiếu ghi đủ: lương cơ bản, ngày tính lương, lương theo công; các khoản thưởng (KPI công việc, KPI công nợ, doanh số, dịch vụ khác, KPI phòng); phụ cấp, điều chỉnh (kèm lý do); tổng thu nhập; khoản trừ BHXH / công đoàn / Đoàn phí; và </w:t>
+      </w:r>
+      <w:r>
+        <w:rPr>
+          <w:b/>
+          <w:bCs/>
+        </w:rPr>
+        <w:t xml:space="preserve">THỰC LĨNH</w:t>
+      </w:r>
+      <w:r>
+        <w:t xml:space="preserve">.</w:t>
+      </w:r>
+    </w:p>
+    <w:p>
+      <w:pPr>
+        <w:pStyle w:val="ListParagraph"/>
+        <w:numPr>
+          <w:ilvl w:val="0"/>
+          <w:numId w:val="3"/>
+        </w:numPr>
+        <w:spacing w:after="60"/>
+      </w:pPr>
+      <w:r>
+        <w:t xml:space="preserve">Đúng → bấm </w:t>
+      </w:r>
+      <w:r>
+        <w:rPr>
+          <w:b/>
+          <w:bCs/>
+        </w:rPr>
+        <w:t xml:space="preserve">✓ Xác nhận đúng</w:t>
+      </w:r>
+      <w:r>
+        <w:t xml:space="preserve">.</w:t>
+      </w:r>
+    </w:p>
+    <w:p>
+      <w:pPr>
+        <w:pStyle w:val="ListParagraph"/>
+        <w:numPr>
+          <w:ilvl w:val="0"/>
+          <w:numId w:val="3"/>
+        </w:numPr>
+        <w:spacing w:after="60"/>
+      </w:pPr>
+      <w:r>
+        <w:t xml:space="preserve">Sai → bấm </w:t>
+      </w:r>
+      <w:r>
+        <w:rPr>
+          <w:b/>
+          <w:bCs/>
+        </w:rPr>
+        <w:t xml:space="preserve">⚠ Báo sai</w:t>
+      </w:r>
+      <w:r>
+        <w:t xml:space="preserve">, ghi rõ chỗ sai (vd </w:t>
+      </w:r>
+      <w:r>
+        <w:rPr>
+          <w:i/>
+          <w:iCs/>
+        </w:rPr>
+        <w:t xml:space="preserve">thiếu 1 ngày công</w:t>
+      </w:r>
+      <w:r>
+        <w:t xml:space="preserve">, </w:t>
+      </w:r>
+      <w:r>
+        <w:rPr>
+          <w:i/>
+          <w:iCs/>
+        </w:rPr>
+        <w:t xml:space="preserve">chưa có thưởng hồ sơ X</w:t>
+      </w:r>
+      <w:r>
+        <w:t xml:space="preserve">) → </w:t>
+      </w:r>
+      <w:r>
+        <w:rPr>
+          <w:b/>
+          <w:bCs/>
+        </w:rPr>
+        <w:t xml:space="preserve">Gửi báo sai</w:t>
+      </w:r>
+      <w:r>
+        <w:t xml:space="preserve">. Kế toán nội bộ sửa rồi gửi lại phiếu, bạn xác nhận lại.</w:t>
+      </w:r>
+    </w:p>
+    <w:p>
+      <w:pPr>
+        <w:pStyle w:val="ListParagraph"/>
+        <w:numPr>
+          <w:ilvl w:val="0"/>
+          <w:numId w:val="3"/>
+        </w:numPr>
+        <w:spacing w:after="60"/>
+      </w:pPr>
+      <w:r>
+        <w:t xml:space="preserve">Tháng nào có phiếu đang chờ bạn xác nhận thì nút tháng đó có dấu </w:t>
+      </w:r>
+      <w:r>
+        <w:rPr>
+          <w:b/>
+          <w:bCs/>
+        </w:rPr>
+        <w:t xml:space="preserve">•</w:t>
+      </w:r>
+      <w:r>
+        <w:t xml:space="preserve">.</w:t>
+      </w:r>
+    </w:p>
+    <w:p>
+      <w:pPr>
+        <w:pBdr>
+          <w:bottom w:val="single" w:color="E7E5E4" w:sz="6" w:space="1"/>
+        </w:pBdr>
+        <w:spacing w:after="120"/>
+      </w:pPr>
+    </w:p>
+    <w:p>
+      <w:pPr>
+        <w:pStyle w:val="Heading1"/>
+      </w:pPr>
+      <w:r>
+        <w:t xml:space="preserve">Phần 4 — Dành cho trưởng phòng</w:t>
       </w:r>
     </w:p>
     <w:p>
@@ -1874,7 +2225,7 @@
         <w:t xml:space="preserve">✎ Sửa</w:t>
       </w:r>
       <w:r>
-        <w:t xml:space="preserve"> ở dòng đó, sửa số ngày, </w:t>
+        <w:t xml:space="preserve"> ở dòng đó, sửa số ngày hoặc số lần vi phạm, </w:t>
       </w:r>
       <w:r>
         <w:rPr>
@@ -2088,7 +2439,17 @@
         <w:t xml:space="preserve">Lương của tôi tính thế nào?</w:t>
       </w:r>
       <w:r>
-        <w:t xml:space="preserve"> Lương theo công = lương cơ bản × ngày tính lương ÷ ngày công chuẩn, cộng các khoản thưởng (KPI công việc, KPI công nợ, doanh số, dịch vụ khác, KPI phòng), trừ BHXH 10,5% + kinh phí công đoàn 0,5% + phí Đoàn 40.000đ (chỉ người đóng BHXH). Kế toán nội bộ tổng hợp và gửi bảng lương — nhân viên không xem bảng lương trên app.</w:t>
+        <w:t xml:space="preserve"> Lương theo công = lương cơ bản × ngày tính lương ÷ ngày công chuẩn, cộng các khoản thưởng (KPI công việc, KPI công nợ, doanh số, dịch vụ khác, KPI phòng), phụ cấp và điều chỉnh, trừ BHXH 10,5% + kinh phí công đoàn 0,5% + phí Đoàn 40.000đ (chỉ người đóng BHXH). Bạn xem đủ các khoản ở tab </w:t>
+      </w:r>
+      <w:r>
+        <w:rPr>
+          <w:b/>
+          <w:bCs/>
+        </w:rPr>
+        <w:t xml:space="preserve">Phiếu lương của tôi</w:t>
+      </w:r>
+      <w:r>
+        <w:t xml:space="preserve">.</w:t>
       </w:r>
     </w:p>
     <w:p>
@@ -2100,6 +2461,21 @@
           <w:b/>
           <w:bCs/>
         </w:rPr>
+        <w:t xml:space="preserve">Thưởng KPI phòng tính thế nào?</w:t>
+      </w:r>
+      <w:r>
+        <w:t xml:space="preserve"> Điểm KPI phòng = trung bình 3 tiêu chí: %-công việc, %-công nợ và %-tác phong của phòng. Mỗi người trong phòng nhận đủ mức: dưới 80% không thưởng · 80–90% được 300.000đ · trên 90% được 500.000đ. Vì vậy một người vi phạm tác phong cũng kéo thưởng của cả phòng.</w:t>
+      </w:r>
+    </w:p>
+    <w:p>
+      <w:pPr>
+        <w:spacing w:after="120"/>
+      </w:pPr>
+      <w:r>
+        <w:rPr>
+          <w:b/>
+          <w:bCs/>
+        </w:rPr>
         <w:t xml:space="preserve">Thưởng KPI lấy số tháng nào?</w:t>
       </w:r>
       <w:r>
@@ -2110,7 +2486,7 @@
           <w:b/>
           <w:bCs/>
         </w:rPr>
-        <w:t xml:space="preserve">%-công việc tháng N−1</w:t>
+        <w:t xml:space="preserve">%-công việc tháng N</w:t>
       </w:r>
       <w:r>
         <w:t xml:space="preserve"> và </w:t>
@@ -2120,10 +2496,10 @@
           <w:b/>
           <w:bCs/>
         </w:rPr>
-        <w:t xml:space="preserve">%-công nợ tháng N−2</w:t>
-      </w:r>
-      <w:r>
-        <w:t xml:space="preserve"> — đúng số trên Báo cáo KPI. Mỗi chỉ số: dưới 80% không thưởng · 80–90% được 300.000đ · trên 90% được 500.000đ.</w:t>
+        <w:t xml:space="preserve">%-công nợ tháng N−1</w:t>
+      </w:r>
+      <w:r>
+        <w:t xml:space="preserve"> (vd lương tháng 10: công việc tháng 10, công nợ tháng 9) — đúng số trên Báo cáo KPI. Doanh thu tính thưởng doanh số cũng lấy tháng N. Mỗi chỉ số: dưới 80% không thưởng · 80–90% được 300.000đ · trên 90% được 500.000đ.</w:t>
       </w:r>
     </w:p>
     <w:p>

</xml_diff>